<commit_message>
docs(cahier des charges): export PDF sans perte et images allégées
LibreOffice convertissait les diagrammes en JPEG à l'export : fichier de 3 Mo
et texte fin dégradé. On force UseLosslessCompression, on prépare les images
à 200 ppi en palette, et on linéarise le PDF. 2,1 Mo au lieu de 3,1 Mo, et
des diagrammes nets.
</commit_message>
<xml_diff>
--- a/docs/cahier-des-charges/GeoCras-Cahier-des-charges.docx
+++ b/docs/cahier-des-charges/GeoCras-Cahier-des-charges.docx
@@ -8113,7 +8113,7 @@
       <w:r>
         <w:drawing>
           <wp:inline xmlns:a="http://schemas.openxmlformats.org/drawingml/2006/main" xmlns:pic="http://schemas.openxmlformats.org/drawingml/2006/picture">
-            <wp:extent cx="5904000" cy="3302237"/>
+            <wp:extent cx="5904000" cy="3301698"/>
             <wp:docPr id="1" name="Picture 1"/>
             <wp:cNvGraphicFramePr>
               <a:graphicFrameLocks noChangeAspect="1"/>
@@ -8134,7 +8134,7 @@
                   <pic:spPr>
                     <a:xfrm>
                       <a:off x="0" y="0"/>
-                      <a:ext cx="5904000" cy="3302237"/>
+                      <a:ext cx="5904000" cy="3301698"/>
                     </a:xfrm>
                     <a:prstGeom prst="rect"/>
                   </pic:spPr>
@@ -8703,7 +8703,7 @@
       <w:r>
         <w:drawing>
           <wp:inline xmlns:a="http://schemas.openxmlformats.org/drawingml/2006/main" xmlns:pic="http://schemas.openxmlformats.org/drawingml/2006/picture">
-            <wp:extent cx="5904000" cy="4157746"/>
+            <wp:extent cx="5904000" cy="4155508"/>
             <wp:docPr id="2" name="Picture 2"/>
             <wp:cNvGraphicFramePr>
               <a:graphicFrameLocks noChangeAspect="1"/>
@@ -8724,7 +8724,7 @@
                   <pic:spPr>
                     <a:xfrm>
                       <a:off x="0" y="0"/>
-                      <a:ext cx="5904000" cy="4157746"/>
+                      <a:ext cx="5904000" cy="4155508"/>
                     </a:xfrm>
                     <a:prstGeom prst="rect"/>
                   </pic:spPr>
@@ -9191,7 +9191,7 @@
       <w:r>
         <w:drawing>
           <wp:inline xmlns:a="http://schemas.openxmlformats.org/drawingml/2006/main" xmlns:pic="http://schemas.openxmlformats.org/drawingml/2006/picture">
-            <wp:extent cx="5904000" cy="4194947"/>
+            <wp:extent cx="5904000" cy="4196382"/>
             <wp:docPr id="3" name="Picture 3"/>
             <wp:cNvGraphicFramePr>
               <a:graphicFrameLocks noChangeAspect="1"/>
@@ -9212,7 +9212,7 @@
                   <pic:spPr>
                     <a:xfrm>
                       <a:off x="0" y="0"/>
-                      <a:ext cx="5904000" cy="4194947"/>
+                      <a:ext cx="5904000" cy="4196382"/>
                     </a:xfrm>
                     <a:prstGeom prst="rect"/>
                   </pic:spPr>
@@ -10277,7 +10277,7 @@
       <w:r>
         <w:drawing>
           <wp:inline xmlns:a="http://schemas.openxmlformats.org/drawingml/2006/main" xmlns:pic="http://schemas.openxmlformats.org/drawingml/2006/picture">
-            <wp:extent cx="5904000" cy="4285161"/>
+            <wp:extent cx="5904000" cy="4287212"/>
             <wp:docPr id="4" name="Picture 4"/>
             <wp:cNvGraphicFramePr>
               <a:graphicFrameLocks noChangeAspect="1"/>
@@ -10298,7 +10298,7 @@
                   <pic:spPr>
                     <a:xfrm>
                       <a:off x="0" y="0"/>
-                      <a:ext cx="5904000" cy="4285161"/>
+                      <a:ext cx="5904000" cy="4287212"/>
                     </a:xfrm>
                     <a:prstGeom prst="rect"/>
                   </pic:spPr>
@@ -10611,7 +10611,7 @@
       <w:r>
         <w:drawing>
           <wp:inline xmlns:a="http://schemas.openxmlformats.org/drawingml/2006/main" xmlns:pic="http://schemas.openxmlformats.org/drawingml/2006/picture">
-            <wp:extent cx="5904000" cy="4920000"/>
+            <wp:extent cx="5904000" cy="4918486"/>
             <wp:docPr id="5" name="Picture 5"/>
             <wp:cNvGraphicFramePr>
               <a:graphicFrameLocks noChangeAspect="1"/>
@@ -10632,7 +10632,7 @@
                   <pic:spPr>
                     <a:xfrm>
                       <a:off x="0" y="0"/>
-                      <a:ext cx="5904000" cy="4920000"/>
+                      <a:ext cx="5904000" cy="4918486"/>
                     </a:xfrm>
                     <a:prstGeom prst="rect"/>
                   </pic:spPr>
@@ -10799,7 +10799,7 @@
       <w:r>
         <w:drawing>
           <wp:inline xmlns:a="http://schemas.openxmlformats.org/drawingml/2006/main" xmlns:pic="http://schemas.openxmlformats.org/drawingml/2006/picture">
-            <wp:extent cx="5904000" cy="4285161"/>
+            <wp:extent cx="5904000" cy="4287212"/>
             <wp:docPr id="6" name="Picture 6"/>
             <wp:cNvGraphicFramePr>
               <a:graphicFrameLocks noChangeAspect="1"/>
@@ -10820,7 +10820,7 @@
                   <pic:spPr>
                     <a:xfrm>
                       <a:off x="0" y="0"/>
-                      <a:ext cx="5904000" cy="4285161"/>
+                      <a:ext cx="5904000" cy="4287212"/>
                     </a:xfrm>
                     <a:prstGeom prst="rect"/>
                   </pic:spPr>
@@ -10939,7 +10939,7 @@
       <w:r>
         <w:drawing>
           <wp:inline xmlns:a="http://schemas.openxmlformats.org/drawingml/2006/main" xmlns:pic="http://schemas.openxmlformats.org/drawingml/2006/picture">
-            <wp:extent cx="5476056" cy="7200000"/>
+            <wp:extent cx="5476887" cy="7200000"/>
             <wp:docPr id="7" name="Picture 7"/>
             <wp:cNvGraphicFramePr>
               <a:graphicFrameLocks noChangeAspect="1"/>
@@ -10960,7 +10960,7 @@
                   <pic:spPr>
                     <a:xfrm>
                       <a:off x="0" y="0"/>
-                      <a:ext cx="5476056" cy="7200000"/>
+                      <a:ext cx="5476887" cy="7200000"/>
                     </a:xfrm>
                     <a:prstGeom prst="rect"/>
                   </pic:spPr>
@@ -11095,7 +11095,7 @@
       <w:r>
         <w:drawing>
           <wp:inline xmlns:a="http://schemas.openxmlformats.org/drawingml/2006/main" xmlns:pic="http://schemas.openxmlformats.org/drawingml/2006/picture">
-            <wp:extent cx="5904000" cy="4465846"/>
+            <wp:extent cx="5904000" cy="4464332"/>
             <wp:docPr id="8" name="Picture 8"/>
             <wp:cNvGraphicFramePr>
               <a:graphicFrameLocks noChangeAspect="1"/>
@@ -11116,7 +11116,7 @@
                   <pic:spPr>
                     <a:xfrm>
                       <a:off x="0" y="0"/>
-                      <a:ext cx="5904000" cy="4465846"/>
+                      <a:ext cx="5904000" cy="4464332"/>
                     </a:xfrm>
                     <a:prstGeom prst="rect"/>
                   </pic:spPr>
@@ -17738,7 +17738,7 @@
             <w:r>
               <w:drawing>
                 <wp:inline xmlns:a="http://schemas.openxmlformats.org/drawingml/2006/main" xmlns:pic="http://schemas.openxmlformats.org/drawingml/2006/picture">
-                  <wp:extent cx="1602947" cy="3383999"/>
+                  <wp:extent cx="1603306" cy="3383999"/>
                   <wp:docPr id="9" name="Picture 9"/>
                   <wp:cNvGraphicFramePr>
                     <a:graphicFrameLocks noChangeAspect="1"/>
@@ -17747,7 +17747,7 @@
                     <a:graphicData uri="http://schemas.openxmlformats.org/drawingml/2006/picture">
                       <pic:pic>
                         <pic:nvPicPr>
-                          <pic:cNvPr id="0" name="00-splash.png"/>
+                          <pic:cNvPr id="0" name="maq-00-splash.png"/>
                           <pic:cNvPicPr/>
                         </pic:nvPicPr>
                         <pic:blipFill>
@@ -17759,7 +17759,7 @@
                         <pic:spPr>
                           <a:xfrm>
                             <a:off x="0" y="0"/>
-                            <a:ext cx="1602947" cy="3383999"/>
+                            <a:ext cx="1603306" cy="3383999"/>
                           </a:xfrm>
                           <a:prstGeom prst="rect"/>
                         </pic:spPr>
@@ -17783,7 +17783,7 @@
             <w:r>
               <w:drawing>
                 <wp:inline xmlns:a="http://schemas.openxmlformats.org/drawingml/2006/main" xmlns:pic="http://schemas.openxmlformats.org/drawingml/2006/picture">
-                  <wp:extent cx="1602947" cy="3383999"/>
+                  <wp:extent cx="1603306" cy="3383999"/>
                   <wp:docPr id="10" name="Picture 10"/>
                   <wp:cNvGraphicFramePr>
                     <a:graphicFrameLocks noChangeAspect="1"/>
@@ -17792,7 +17792,7 @@
                     <a:graphicData uri="http://schemas.openxmlformats.org/drawingml/2006/picture">
                       <pic:pic>
                         <pic:nvPicPr>
-                          <pic:cNvPr id="0" name="01-accueil-carte.png"/>
+                          <pic:cNvPr id="0" name="maq-01-accueil-carte.png"/>
                           <pic:cNvPicPr/>
                         </pic:nvPicPr>
                         <pic:blipFill>
@@ -17804,7 +17804,7 @@
                         <pic:spPr>
                           <a:xfrm>
                             <a:off x="0" y="0"/>
-                            <a:ext cx="1602947" cy="3383999"/>
+                            <a:ext cx="1603306" cy="3383999"/>
                           </a:xfrm>
                           <a:prstGeom prst="rect"/>
                         </pic:spPr>
@@ -17925,7 +17925,7 @@
             <w:r>
               <w:drawing>
                 <wp:inline xmlns:a="http://schemas.openxmlformats.org/drawingml/2006/main" xmlns:pic="http://schemas.openxmlformats.org/drawingml/2006/picture">
-                  <wp:extent cx="1602947" cy="3383999"/>
+                  <wp:extent cx="1603306" cy="3383999"/>
                   <wp:docPr id="11" name="Picture 11"/>
                   <wp:cNvGraphicFramePr>
                     <a:graphicFrameLocks noChangeAspect="1"/>
@@ -17934,7 +17934,7 @@
                     <a:graphicData uri="http://schemas.openxmlformats.org/drawingml/2006/picture">
                       <pic:pic>
                         <pic:nvPicPr>
-                          <pic:cNvPr id="0" name="02-declarer-panne.png"/>
+                          <pic:cNvPr id="0" name="maq-02-declarer-panne.png"/>
                           <pic:cNvPicPr/>
                         </pic:nvPicPr>
                         <pic:blipFill>
@@ -17946,7 +17946,7 @@
                         <pic:spPr>
                           <a:xfrm>
                             <a:off x="0" y="0"/>
-                            <a:ext cx="1602947" cy="3383999"/>
+                            <a:ext cx="1603306" cy="3383999"/>
                           </a:xfrm>
                           <a:prstGeom prst="rect"/>
                         </pic:spPr>
@@ -17970,7 +17970,7 @@
             <w:r>
               <w:drawing>
                 <wp:inline xmlns:a="http://schemas.openxmlformats.org/drawingml/2006/main" xmlns:pic="http://schemas.openxmlformats.org/drawingml/2006/picture">
-                  <wp:extent cx="1602947" cy="3383999"/>
+                  <wp:extent cx="1603306" cy="3383999"/>
                   <wp:docPr id="12" name="Picture 12"/>
                   <wp:cNvGraphicFramePr>
                     <a:graphicFrameLocks noChangeAspect="1"/>
@@ -17979,7 +17979,7 @@
                     <a:graphicData uri="http://schemas.openxmlformats.org/drawingml/2006/picture">
                       <pic:pic>
                         <pic:nvPicPr>
-                          <pic:cNvPr id="0" name="03-resultats-fiche.png"/>
+                          <pic:cNvPr id="0" name="maq-03-resultats-fiche.png"/>
                           <pic:cNvPicPr/>
                         </pic:nvPicPr>
                         <pic:blipFill>
@@ -17991,7 +17991,7 @@
                         <pic:spPr>
                           <a:xfrm>
                             <a:off x="0" y="0"/>
-                            <a:ext cx="1602947" cy="3383999"/>
+                            <a:ext cx="1603306" cy="3383999"/>
                           </a:xfrm>
                           <a:prstGeom prst="rect"/>
                         </pic:spPr>
@@ -18112,7 +18112,7 @@
             <w:r>
               <w:drawing>
                 <wp:inline xmlns:a="http://schemas.openxmlformats.org/drawingml/2006/main" xmlns:pic="http://schemas.openxmlformats.org/drawingml/2006/picture">
-                  <wp:extent cx="1602947" cy="3383999"/>
+                  <wp:extent cx="1603306" cy="3383999"/>
                   <wp:docPr id="13" name="Picture 13"/>
                   <wp:cNvGraphicFramePr>
                     <a:graphicFrameLocks noChangeAspect="1"/>
@@ -18121,7 +18121,7 @@
                     <a:graphicData uri="http://schemas.openxmlformats.org/drawingml/2006/picture">
                       <pic:pic>
                         <pic:nvPicPr>
-                          <pic:cNvPr id="0" name="04-itineraire-suivi.png"/>
+                          <pic:cNvPr id="0" name="maq-04-itineraire-suivi.png"/>
                           <pic:cNvPicPr/>
                         </pic:nvPicPr>
                         <pic:blipFill>
@@ -18133,7 +18133,7 @@
                         <pic:spPr>
                           <a:xfrm>
                             <a:off x="0" y="0"/>
-                            <a:ext cx="1602947" cy="3383999"/>
+                            <a:ext cx="1603306" cy="3383999"/>
                           </a:xfrm>
                           <a:prstGeom prst="rect"/>
                         </pic:spPr>
@@ -18157,7 +18157,7 @@
             <w:r>
               <w:drawing>
                 <wp:inline xmlns:a="http://schemas.openxmlformats.org/drawingml/2006/main" xmlns:pic="http://schemas.openxmlformats.org/drawingml/2006/picture">
-                  <wp:extent cx="1602947" cy="3383999"/>
+                  <wp:extent cx="1603306" cy="3383999"/>
                   <wp:docPr id="14" name="Picture 14"/>
                   <wp:cNvGraphicFramePr>
                     <a:graphicFrameLocks noChangeAspect="1"/>
@@ -18166,7 +18166,7 @@
                     <a:graphicData uri="http://schemas.openxmlformats.org/drawingml/2006/picture">
                       <pic:pic>
                         <pic:nvPicPr>
-                          <pic:cNvPr id="0" name="05-details-avis.png"/>
+                          <pic:cNvPr id="0" name="maq-05-details-avis.png"/>
                           <pic:cNvPicPr/>
                         </pic:nvPicPr>
                         <pic:blipFill>
@@ -18178,7 +18178,7 @@
                         <pic:spPr>
                           <a:xfrm>
                             <a:off x="0" y="0"/>
-                            <a:ext cx="1602947" cy="3383999"/>
+                            <a:ext cx="1603306" cy="3383999"/>
                           </a:xfrm>
                           <a:prstGeom prst="rect"/>
                         </pic:spPr>
@@ -18299,7 +18299,7 @@
             <w:r>
               <w:drawing>
                 <wp:inline xmlns:a="http://schemas.openxmlformats.org/drawingml/2006/main" xmlns:pic="http://schemas.openxmlformats.org/drawingml/2006/picture">
-                  <wp:extent cx="1602947" cy="3383999"/>
+                  <wp:extent cx="1603306" cy="3383999"/>
                   <wp:docPr id="15" name="Picture 15"/>
                   <wp:cNvGraphicFramePr>
                     <a:graphicFrameLocks noChangeAspect="1"/>
@@ -18308,7 +18308,7 @@
                     <a:graphicData uri="http://schemas.openxmlformats.org/drawingml/2006/picture">
                       <pic:pic>
                         <pic:nvPicPr>
-                          <pic:cNvPr id="0" name="06-conduite-demarrer.png"/>
+                          <pic:cNvPr id="0" name="maq-06-conduite-demarrer.png"/>
                           <pic:cNvPicPr/>
                         </pic:nvPicPr>
                         <pic:blipFill>
@@ -18320,7 +18320,7 @@
                         <pic:spPr>
                           <a:xfrm>
                             <a:off x="0" y="0"/>
-                            <a:ext cx="1602947" cy="3383999"/>
+                            <a:ext cx="1603306" cy="3383999"/>
                           </a:xfrm>
                           <a:prstGeom prst="rect"/>
                         </pic:spPr>
@@ -18344,7 +18344,7 @@
             <w:r>
               <w:drawing>
                 <wp:inline xmlns:a="http://schemas.openxmlformats.org/drawingml/2006/main" xmlns:pic="http://schemas.openxmlformats.org/drawingml/2006/picture">
-                  <wp:extent cx="1602947" cy="3383999"/>
+                  <wp:extent cx="1603306" cy="3383999"/>
                   <wp:docPr id="16" name="Picture 16"/>
                   <wp:cNvGraphicFramePr>
                     <a:graphicFrameLocks noChangeAspect="1"/>
@@ -18353,7 +18353,7 @@
                     <a:graphicData uri="http://schemas.openxmlformats.org/drawingml/2006/picture">
                       <pic:pic>
                         <pic:nvPicPr>
-                          <pic:cNvPr id="0" name="07-conduite-actif.png"/>
+                          <pic:cNvPr id="0" name="maq-07-conduite-actif.png"/>
                           <pic:cNvPicPr/>
                         </pic:nvPicPr>
                         <pic:blipFill>
@@ -18365,7 +18365,7 @@
                         <pic:spPr>
                           <a:xfrm>
                             <a:off x="0" y="0"/>
-                            <a:ext cx="1602947" cy="3383999"/>
+                            <a:ext cx="1603306" cy="3383999"/>
                           </a:xfrm>
                           <a:prstGeom prst="rect"/>
                         </pic:spPr>
@@ -18486,7 +18486,7 @@
             <w:r>
               <w:drawing>
                 <wp:inline xmlns:a="http://schemas.openxmlformats.org/drawingml/2006/main" xmlns:pic="http://schemas.openxmlformats.org/drawingml/2006/picture">
-                  <wp:extent cx="1602947" cy="3383999"/>
+                  <wp:extent cx="1603306" cy="3383999"/>
                   <wp:docPr id="17" name="Picture 17"/>
                   <wp:cNvGraphicFramePr>
                     <a:graphicFrameLocks noChangeAspect="1"/>
@@ -18495,7 +18495,7 @@
                     <a:graphicData uri="http://schemas.openxmlformats.org/drawingml/2006/picture">
                       <pic:pic>
                         <pic:nvPicPr>
-                          <pic:cNvPr id="0" name="08-profil-fidelite.png"/>
+                          <pic:cNvPr id="0" name="maq-08-profil-fidelite.png"/>
                           <pic:cNvPicPr/>
                         </pic:nvPicPr>
                         <pic:blipFill>
@@ -18507,7 +18507,7 @@
                         <pic:spPr>
                           <a:xfrm>
                             <a:off x="0" y="0"/>
-                            <a:ext cx="1602947" cy="3383999"/>
+                            <a:ext cx="1603306" cy="3383999"/>
                           </a:xfrm>
                           <a:prstGeom prst="rect"/>
                         </pic:spPr>
@@ -18531,7 +18531,7 @@
             <w:r>
               <w:drawing>
                 <wp:inline xmlns:a="http://schemas.openxmlformats.org/drawingml/2006/main" xmlns:pic="http://schemas.openxmlformats.org/drawingml/2006/picture">
-                  <wp:extent cx="1602947" cy="3383999"/>
+                  <wp:extent cx="1603306" cy="3383999"/>
                   <wp:docPr id="18" name="Picture 18"/>
                   <wp:cNvGraphicFramePr>
                     <a:graphicFrameLocks noChangeAspect="1"/>
@@ -18540,7 +18540,7 @@
                     <a:graphicData uri="http://schemas.openxmlformats.org/drawingml/2006/picture">
                       <pic:pic>
                         <pic:nvPicPr>
-                          <pic:cNvPr id="0" name="09-menu-lateral.png"/>
+                          <pic:cNvPr id="0" name="maq-09-menu-lateral.png"/>
                           <pic:cNvPicPr/>
                         </pic:nvPicPr>
                         <pic:blipFill>
@@ -18552,7 +18552,7 @@
                         <pic:spPr>
                           <a:xfrm>
                             <a:off x="0" y="0"/>
-                            <a:ext cx="1602947" cy="3383999"/>
+                            <a:ext cx="1603306" cy="3383999"/>
                           </a:xfrm>
                           <a:prstGeom prst="rect"/>
                         </pic:spPr>
@@ -18632,7 +18632,7 @@
       <w:r>
         <w:drawing>
           <wp:inline xmlns:a="http://schemas.openxmlformats.org/drawingml/2006/main" xmlns:pic="http://schemas.openxmlformats.org/drawingml/2006/picture">
-            <wp:extent cx="2216842" cy="4680000"/>
+            <wp:extent cx="2217338" cy="4679999"/>
             <wp:docPr id="19" name="Picture 19"/>
             <wp:cNvGraphicFramePr>
               <a:graphicFrameLocks noChangeAspect="1"/>
@@ -18641,7 +18641,7 @@
               <a:graphicData uri="http://schemas.openxmlformats.org/drawingml/2006/picture">
                 <pic:pic>
                   <pic:nvPicPr>
-                    <pic:cNvPr id="0" name="10-parametres-sombre.png"/>
+                    <pic:cNvPr id="0" name="maq-10-parametres-sombre.png"/>
                     <pic:cNvPicPr/>
                   </pic:nvPicPr>
                   <pic:blipFill>
@@ -18653,7 +18653,7 @@
                   <pic:spPr>
                     <a:xfrm>
                       <a:off x="0" y="0"/>
-                      <a:ext cx="2216842" cy="4680000"/>
+                      <a:ext cx="2217338" cy="4679999"/>
                     </a:xfrm>
                     <a:prstGeom prst="rect"/>
                   </pic:spPr>

</xml_diff>